<commit_message>
Trim ethics report V2 to ~1850 words
https://claude.ai/code/session_01YMeGpkxrPYFqX6acqjcPet
</commit_message>
<xml_diff>
--- a/A2C_Ethics_Report_V2.docx
+++ b/A2C_Ethics_Report_V2.docx
@@ -199,12 +199,12 @@
     </w:p>
     <w:p>
       <w:r>
-        <w:t>The Traffic-Based Route Guidance System (TBRGS) involves a number of design and technical decisions that carry ethical implications for its users and developers. This report examines three such decisions. The first concerns the selection of search algorithms and the transparency of the routing decisions they produce — specifically, whether users can understand why a particular route was recommended over others. The second concerns the transparency and representational accuracy of the machine learning models used for traffic prediction, including the use of outdated training data and fixed constants that do not accurately reflect real-world conditions at every intersection. A potential extension, TBRGS+, introduces a third set of concerns around the collection of sensitive personal data including home and work locations, and the particular obligations that arise when the system may be used by children and young people.</w:t>
+        <w:t>The Traffic-Based Route Guidance System (TBRGS) makes several design and technical decisions that carry ethical implications for its users and developers. This report examines three such decisions. The first concerns the selection of search algorithms and the transparency of the routing decisions they produce — specifically, whether users can understand why a particular route was recommended. The second concerns the transparency and representational accuracy of the machine learning models used for traffic prediction, including the use of outdated training data and fixed constants that do not accurately reflect real-world conditions across every intersection. A potential TBRGS+ mobile extension introduces a third set of concerns around the collection of sensitive personal data, including home and work locations, and the particular obligations that arise when the system may be used by children.</w:t>
       </w:r>
     </w:p>
     <w:p>
       <w:r>
-        <w:t>Analysis of these decisions shows that in each case more ethical alternatives exist. Algorithm selection should be guided by both performance and explainability, and users should be informed about the limitations of route recommendations. The ML models should be improved through more recent and granular data, and additional features that better reflect real intersection conditions. For TBRGS+, a strict data minimisation policy and compliance with Australian children's privacy law are essential prerequisites before the system is made publicly available. The recommendations in this report centre on transparency, honesty about system limitations, and a privacy-by-design approach for any future extension.</w:t>
+        <w:t>In each case more ethical alternatives exist. Algorithm selection should be guided by explainability as well as performance, and users should be informed about the basis of their route recommendation. The ML models should communicate their assumptions and limitations honestly, particularly given the age of the training data and the fixed constants applied in the travel time calculation. For TBRGS+, a strict data minimisation policy and compliance with Australian children's privacy law are essential prerequisites before any public release.</w:t>
       </w:r>
     </w:p>
     <w:p>
@@ -222,17 +222,17 @@
     </w:p>
     <w:p>
       <w:r>
-        <w:t>The TBRGS is a desktop application that predicts traffic flow across 39 SCATS intersections in Melbourne's Boroondara area using three machine learning models — LSTM, GRU, and XGBoost — trained on historical 15-minute interval traffic volume data. These predictions are used to weight the edges of a directed road network graph, over which six search algorithms (BFS, DFS, Greedy Best-First, A*, Dijkstra, and Bidirectional A*) find and rank candidate routes by estimated travel time.</w:t>
+        <w:t>TBRGS is a desktop application that predicts traffic flow across 39 SCATS intersections in Melbourne's Boroondara area using LSTM, GRU, and XGBoost models trained on historical 15-minute traffic volume data. Predictions weight the edges of a directed road network graph over which six search algorithms — BFS, DFS, Greedy Best-First, A*, Dijkstra, and Bidirectional A* — find and rank candidate routes by estimated travel time.</w:t>
       </w:r>
     </w:p>
     <w:p>
       <w:r>
-        <w:t>While the system currently operates on anonymised historical data and does not collect personal user information, the design decisions made during development carry ethical dimensions that warrant examination. The choice of search algorithm and how the system communicates its recommendations affects whether users can trust and understand the routes they are given. The accuracy and honesty of the underlying ML models — including the real-world validity of the constants and assumptions built into the travel time model — determine whether the system represents road conditions truthfully. A potential TBRGS+ mobile extension would collect sensitive personal location data and may be used by children, introducing significant additional legal and ethical obligations.</w:t>
+        <w:t>While the system operates on anonymised historical data and does not currently collect personal information, its design decisions carry ethical dimensions. The choice of algorithm and how the system communicates its reasoning affects user trust. The validity of the ML models' assumptions determines whether the system represents road conditions honestly. A potential TBRGS+ extension would collect sensitive location data and may be used by children, introducing significant legal and ethical obligations.</w:t>
       </w:r>
     </w:p>
     <w:p>
       <w:r>
-        <w:t>This report identifies and analyses three key design decisions, presents alternatives for each, and makes recommendations to guide the development team toward more ethical design choices.</w:t>
+        <w:t>This report identifies and analyses these three decisions, presents alternatives for each, and makes recommendations to guide the development team toward more ethical design choices.</w:t>
       </w:r>
     </w:p>
     <w:p>
@@ -258,22 +258,22 @@
     </w:p>
     <w:p>
       <w:r>
-        <w:t>The TBRGS implements six search algorithms: BFS, DFS, Greedy Best-First, A*, Dijkstra, and Bidirectional A*. Each algorithm explores the road network differently and can return a different route for the same origin-destination pair. The system's default for route recommendations uses A*, while the Compare Algorithms feature runs all six and presents their results side by side. This raises an important ethical question: when different algorithms produce different routes, how does the user know which to trust, and on what basis was the recommended route selected?</w:t>
+        <w:t>TBRGS implements six search algorithms — BFS, DFS, Greedy Best-First, A*, Dijkstra, and Bidirectional A* — each of which explores the road network differently and can return a different route for the same origin–destination pair. The system defaults to A* for route recommendations while the Compare Algorithms feature runs all six side by side. This raises a transparency question: when algorithms disagree on the best route, how does the user know which result to trust and on what basis the recommended route was selected over the alternatives?</w:t>
       </w:r>
     </w:p>
     <w:p>
       <w:r>
-        <w:t>Transparency of decision making is a recognised requirement for responsible AI. Australia's AI Ethics Principles (Department of Industry, Science and Resources, 2024) state that AI systems should be explainable to the degree necessary for users to understand and contest outcomes. In the TBRGS context, a user who receives a route recommendation has no visibility into which algorithm produced it, what alternatives were considered, or why those alternatives were ranked lower. The system presents a result without the reasoning behind it.</w:t>
+        <w:t>Transparency of decision making is a recognised requirement for responsible AI. Australia's AI Ethics Principles (Department of Industry, Science and Resources, 2024) state that AI systems should be explainable to the degree necessary for users to understand and contest outcomes. In the TBRGS context, a user who receives a route recommendation has no visibility into which algorithm produced it, what alternatives were considered, or why those alternatives were ranked lower. The system presents a result without the reasoning behind it, making it difficult for users to exercise informed judgement about whether to follow the recommendation.</w:t>
       </w:r>
     </w:p>
     <w:p>
       <w:r>
-        <w:t>The heuristic used by A* and Greedy Best-First — haversine straight-line distance — is a further transparency concern. The haversine distance is an approximation that does not account for the actual road layout, one-way streets, or geographic barriers. In areas with curved roads or obstructions, the heuristic may systematically underestimate the true cost of certain edges, biasing the search toward routes that appear geographically direct but are not actually faster. Users are not informed of this limitation.</w:t>
+        <w:t>The haversine heuristic used by A* and Greedy Best-First is a further concern. Haversine straight-line distance does not account for actual road layouts, one-way streets, or geographic barriers. In areas with curved roads or obstructions, the heuristic may underestimate the cost of certain edges, biasing the search toward routes that appear geographically direct but are not actually faster.</w:t>
       </w:r>
     </w:p>
     <w:p>
       <w:r>
-        <w:t>Two alternatives are worth considering. First, the system could display a brief explanation alongside each route recommendation — for example, identifying which algorithm found the route and noting that it is based on predicted travel time using historical traffic data. This is a low-cost change that significantly improves transparency. Second, the heuristic could be replaced or supplemented with actual road distance data, producing more accurate cost estimates in areas where straight-line distance is a poor proxy. The Compare Algorithms feature already partially addresses transparency by showing users that multiple algorithms reach the same conclusion, but this is only visible when the user actively runs the comparison — it is not surfaced in the default route recommendation flow.</w:t>
+        <w:t>Two alternatives are worth considering. First, the system could display a brief explanation alongside each recommendation — identifying the algorithm used and noting that the estimate is based on predicted historical traffic flows. This is a low-cost change that significantly improves transparency. Second, the haversine heuristic could be supplemented with actual road distance data, producing more accurate cost estimates in areas where straight-line distance is a poor proxy for travel time. The Compare Algorithms feature already partially addresses transparency by showing users that multiple methods reach similar conclusions, but this is only visible when the user actively runs the comparison — it is not surfaced in the default route recommendation flow.</w:t>
       </w:r>
     </w:p>
     <w:p>
@@ -286,27 +286,27 @@
     </w:p>
     <w:p>
       <w:r>
-        <w:t>The TBRGS travel time model converts predicted traffic flow into an estimated travel time using two fixed constants: a speed limit of 60 km/h and an intersection delay of 30 seconds. These values are taken from the specification document and applied uniformly across all 39 SCATS intersections. In practice, neither constant holds everywhere. Speed limits in the Boroondara network vary between 40 km/h in residential streets and 60 km/h on arterials. Intersection delays vary significantly depending on signal timing, turning movements, and pedestrian phases — a 30-second delay may be appropriate at a simple two-phase intersection but significantly underestimates delay at a complex multi-phase intersection during peak hours.</w:t>
+        <w:t>The TBRGS travel time model converts predicted flow into an estimated travel time using two fixed constants: a speed limit of 60 km/h and an intersection delay of 30 seconds, applied uniformly across all 39 intersections. In practice, speed limits in Boroondara range from 40 km/h on residential streets to 60 km/h on arterials, and intersection delays vary substantially with signal timing and turning movements. A 30-second delay may be reasonable at a simple two-phase intersection but significantly underestimates delay at a complex multi-phase intersection during peak hours.</w:t>
       </w:r>
     </w:p>
     <w:p>
       <w:r>
-        <w:t>This is an ethical issue of honesty and accurate representation. The system presents travel time estimates as precise figures (e.g. "18.5 minutes") without communicating that these figures are based on simplified assumptions that may not hold at specific locations. A user who relies on a route time that is systematically underestimated — because the route passes through a complex intersection with long signal cycles — may make journey decisions based on inaccurate information. Floridi et al. (2018) identify non-maleficence and beneficence as core AI ethics principles: a system that presents imprecise estimates as precise measurements risks actively misleading users.</w:t>
+        <w:t>The system presents travel time estimates as precise figures without communicating that they rest on these simplified assumptions. Floridi et al. (2018) identify non-maleficence and beneficence as core AI ethics principles: a system that presents imprecise estimates as precise measurements risks misleading users who make journey decisions based on those figures.</w:t>
       </w:r>
     </w:p>
     <w:p>
       <w:r>
-        <w:t>The training data introduces a further representational concern. The ML models are trained on traffic volume data from October 2006 — nearly 20 years old. Road conditions, intersection layouts, surrounding land use, and travel behaviour have changed substantially in that time. The addition of new residential developments, changes to public transport, and shifts in commuting patterns post-COVID mean that 2006 traffic patterns may no longer represent current conditions. A model trained on outdated data may confidently predict flows that are systematically wrong for certain sites or times of day.</w:t>
+        <w:t>The ML models are trained on data from October 2006 — nearly 20 years old. Road layouts, surrounding land use, public transport provision, and commuting behaviour have changed substantially since then. Post-COVID shifts in work patterns mean that 2006 traffic volumes may no longer represent current conditions at many intersections, particularly during morning and afternoon peak periods where hybrid working has reshaped demand.</w:t>
       </w:r>
     </w:p>
     <w:p>
       <w:r>
-        <w:t>Mizan et al. (2019) provide a comprehensive review of deep learning methods for traffic flow prediction, identifying several improvements applicable to the TBRGS. These include training on finer-grained time intervals (5-minute or 1-minute data rather than 15-minute) to better capture rapid flow changes during peak periods; incorporating additional input features such as weather conditions, day type (public holiday, school day), and spatial adjacency between intersections; and using attention mechanisms within LSTM and GRU architectures to allow the model to weight earlier time steps by relevance rather than treating all steps equally. These improvements would not only increase prediction accuracy but would reduce the risk of systematically misleading users during atypical conditions.</w:t>
+        <w:t>Mizan et al. (2019) identify several applicable improvements: finer-grained time intervals (5-minute or 1-minute rather than 15-minute data) to better capture rapid peak-period changes; additional input features such as weather, day type, and spatial adjacency between intersections; and attention mechanisms within LSTM and GRU architectures to weight earlier timesteps by relevance. These would improve accuracy and reduce the risk of misleading users under atypical conditions.</w:t>
       </w:r>
     </w:p>
     <w:p>
       <w:r>
-        <w:t>From an ethical standpoint, the most immediately actionable improvement is transparency: the system should communicate the assumptions underlying its travel time estimates — the fixed speed limit, the uniform intersection delay, and the age of the training data — so that users can apply appropriate scepticism to the figures they receive. Displaying a confidence range alongside the estimated time, rather than a single number, would more honestly represent the uncertainty inherent in the prediction.</w:t>
+        <w:t>The most immediately actionable improvement is transparency: the system should communicate the assumptions underlying its travel time estimates — the fixed 60 km/h speed limit, the uniform 30-second intersection delay, and the age of the training data — so that users can apply appropriate scepticism to the figures they receive. Displaying a confidence range alongside the estimated time, rather than a single precise number, would more honestly represent the inherent uncertainty in the prediction and reduce the risk of users placing unwarranted trust in estimates that may be substantially off during atypical conditions.</w:t>
       </w:r>
     </w:p>
     <w:p>
@@ -319,22 +319,22 @@
     </w:p>
     <w:p>
       <w:r>
-        <w:t>A mobile TBRGS+ application would require access to the user's real-time GPS location to determine their starting point. To deliver convenient features such as one-tap routing from home or work, the application would also store these locations as part of a user profile. This creates a dataset of highly sensitive personal information: home address, workplace, and a continuous record of the user's movements. Even when stored for a benign navigation purpose, this data can reveal patterns of religious attendance, medical visits, political activity, and personal relationships — information that users may not intend to disclose simply by using a routing application (Zuboff, 2019).</w:t>
+        <w:t>A TBRGS+ mobile application would require real-time GPS access to determine the user's starting point. Convenience features such as one-tap home-to-work routing would additionally require storing home and work addresses in a user profile. This creates a dataset of highly sensitive personal information: home address, workplace, and an ongoing record of the user's movements through the network. Even stored for a benign navigation purpose, this data can reveal patterns of religious attendance, medical visits, and personal relationships — information users may not intend to disclose simply by using a routing application (Zuboff, 2019).</w:t>
       </w:r>
     </w:p>
     <w:p>
       <w:r>
-        <w:t>The key design decision is what data to collect, how long to retain it, and who may access it. The minimum viable approach is to use location data only in real time for the current route request and never store it persistently. Home and work locations, if offered as a convenience feature, should be stored locally on the device rather than on a central server, reducing the risk of a data breach exposing the personal details of all users simultaneously. Any server-side storage of location data must comply with the Australian Privacy Act 1988, which requires that personal data be collected only for a clearly stated purpose, with the individual's informed consent, and be protected against unauthorised access (Office of the Australian Information Commissioner, 2023).</w:t>
+        <w:t>The minimum viable approach is to use location data only in real time and never store it persistently. Home and work locations, if offered as a convenience feature, should be stored on-device rather than server-side, limiting exposure in the event of a breach. Any server-side storage must comply with the Australian Privacy Act 1988, which requires personal data to be collected only for a clearly stated purpose with informed consent (Office of the Australian Information Commissioner, 2023).</w:t>
       </w:r>
     </w:p>
     <w:p>
       <w:r>
-        <w:t>A particularly significant concern for TBRGS+ is the potential use of the application by children and young people. If the application is made publicly available — for example, through an app store — there is no inherent mechanism preventing minors from using it. The Australian Children's Online Privacy Code, developed under the Privacy Act 1988, places additional obligations on services likely to be accessed by children under 15, including stronger consent requirements, restrictions on the collection and use of children's personal data, and prohibitions on using children's data for targeted advertising or profiling (Office of the Australian Information Commissioner, 2023). Location data is among the most sensitive categories of children's personal information because it can expose a child's home address, school, and daily routine to third parties.</w:t>
+        <w:t>A significant additional concern is the potential use of TBRGS+ by children. If distributed through an app store, there is no inherent barrier preventing minors from accessing it. The Australian Children's Online Privacy Code places additional obligations on services likely to be accessed by children under 15, including stronger consent requirements and restrictions on collecting and using children's location data — among the most sensitive category of children's personal information, as it can expose home address, school, and daily routine.</w:t>
       </w:r>
     </w:p>
     <w:p>
       <w:r>
-        <w:t>The development team faces a choice between three approaches. The first is to restrict the application to adult users through an age verification mechanism, which reduces the regulatory burden but limits the application's reach. The second is to implement child-safe defaults — collecting no persistent data, storing nothing server-side, and disabling any profile or history features — for users who identify as under 15. The third, and least ethical, approach is to make no age distinction and collect data uniformly, which would place the developer in breach of the Children's Online Privacy Code. The second approach represents the most balanced solution: it maintains functionality for adult users while meeting the legal and ethical obligations owed to younger users.</w:t>
+        <w:t>The development team should implement child-safe defaults: for users under 15, disable all persistent data collection and profile features, store nothing server-side, and comply with the Children's Online Privacy Code from the outset of development. Treating children's location data as a special category requiring additional protection is both a legal requirement and a straightforward ethical commitment that should be built into the architecture from the start rather than retrofitted later.</w:t>
       </w:r>
     </w:p>
     <w:p>
@@ -352,7 +352,7 @@
     </w:p>
     <w:p>
       <w:r>
-        <w:t>This report has examined three design decisions across TBRGS and TBRGS+ and analysed their ethical implications. Each decision involves a trade-off between convenience or performance and ethical obligations to users. The following recommendations are made:</w:t>
+        <w:t>This report has examined three design decisions across TBRGS and TBRGS+ and analysed their ethical implications. Each decision involves a trade-off between convenience or performance and the ethical obligations owed to users. The following recommendations are made:</w:t>
       </w:r>
     </w:p>
     <w:p>
@@ -360,7 +360,7 @@
         <w:pStyle w:val="ListBullet"/>
       </w:pPr>
       <w:r>
-        <w:t>Improve algorithm transparency. Display a brief explanation alongside each route recommendation indicating how the route was found and what assumptions underlie the travel time estimate. The Compare Algorithms feature should be more prominently signposted so users understand that multiple methods were considered.</w:t>
+        <w:t>Improve algorithm transparency. Display a brief explanation alongside each route recommendation indicating which algorithm was used and that estimates are based on historical predicted traffic data.</w:t>
       </w:r>
     </w:p>
     <w:p>
@@ -368,7 +368,7 @@
         <w:pStyle w:val="ListBullet"/>
       </w:pPr>
       <w:r>
-        <w:t>Communicate model limitations honestly. Travel time estimates should be presented alongside a note that they are based on a 60 km/h speed limit and 30-second intersection delay applied uniformly, and that training data is from 2006. A confidence range rather than a single figure would more accurately represent the uncertainty in the prediction.</w:t>
+        <w:t>Communicate model limitations honestly. Note the fixed 60 km/h speed limit, 30-second intersection delay, and 2006 training data alongside travel time estimates. A confidence range would more accurately represent prediction uncertainty.</w:t>
       </w:r>
     </w:p>
     <w:p>
@@ -376,7 +376,7 @@
         <w:pStyle w:val="ListBullet"/>
       </w:pPr>
       <w:r>
-        <w:t>Improve model representational accuracy. Where possible, update training data to more recent sources and incorporate variable speed limits and intersection-specific delay values. Implementing finer time granularity and additional features such as weather and day type, as recommended by Mizan et al. (2019), would significantly reduce the risk of systematically misleading users under atypical conditions.</w:t>
+        <w:t>Improve model accuracy. Update training data where possible and incorporate variable speed limits and intersection-specific delays. Implement finer time granularity and additional features (weather, day type) as recommended by Mizan et al. (2019).</w:t>
       </w:r>
     </w:p>
     <w:p>
@@ -384,7 +384,7 @@
         <w:pStyle w:val="ListBullet"/>
       </w:pPr>
       <w:r>
-        <w:t>Adopt minimal data collection for TBRGS+. Store home and work locations on-device only. Do not retain location history server-side. All data collection must comply with the Australian Privacy Act 1988 with clear, specific informed consent.</w:t>
+        <w:t>Adopt minimal data collection for TBRGS+. Store home and work locations on-device only. Do not retain location history server-side. Comply with the Privacy Act 1988 with clear informed consent.</w:t>
       </w:r>
     </w:p>
     <w:p>
@@ -392,7 +392,7 @@
         <w:pStyle w:val="ListBullet"/>
       </w:pPr>
       <w:r>
-        <w:t>Implement child-safe defaults. For users under 15, disable all persistent data collection and profile features. Comply with the Australian Children's Online Privacy Code from the outset of TBRGS+ development, treating children's data as a special category requiring additional protection.</w:t>
+        <w:t>Implement child-safe defaults. For users under 15, disable all persistent data collection and profile features. Comply with the Australian Children's Online Privacy Code from the outset of TBRGS+ development.</w:t>
       </w:r>
     </w:p>
     <w:p>

</xml_diff>

<commit_message>
Replace fabricated Mizan citation with Huang et al. 2020 on DNN interpretability
https://claude.ai/code/session_01YMeGpkxrPYFqX6acqjcPet
</commit_message>
<xml_diff>
--- a/A2C_Ethics_Report_V2.docx
+++ b/A2C_Ethics_Report_V2.docx
@@ -301,7 +301,7 @@
     </w:p>
     <w:p>
       <w:r>
-        <w:t>Mizan et al. (2019) identify several applicable improvements: finer-grained time intervals (5-minute or 1-minute rather than 15-minute data) to better capture rapid peak-period changes; additional input features such as weather, day type, and spatial adjacency between intersections; and attention mechanisms within LSTM and GRU architectures to weight earlier timesteps by relevance. These would improve accuracy and reduce the risk of misleading users under atypical conditions.</w:t>
+        <w:t>Huang et al. (2020) survey a range of interpretability techniques applicable to deep learning models such as those used in TBRGS. Of particular relevance is SHapley Additive exPlanations (SHAP), which assigns each input feature an importance score representing its contribution to a specific prediction. Applied to the TBRGS models, SHAP values could reveal which inputs — time of day, day of week, or SCATS site — most strongly drive a predicted flow value, and whether the models have learned genuine temporal patterns or are over-fitting to site-specific noise in the 2006 training data. LIME (Local Interpretable Model-agnostic Explanations) can similarly approximate a black-box model's behaviour around a specific prediction using a simpler linear model, providing a per-prediction explanation that users or auditors could interrogate. XGBoost, by contrast, exposes native feature importance rankings, making its reasoning more directly accessible without additional tooling.</w:t>
       </w:r>
     </w:p>
     <w:p>
@@ -376,7 +376,7 @@
         <w:pStyle w:val="ListBullet"/>
       </w:pPr>
       <w:r>
-        <w:t>Improve model accuracy. Update training data where possible and incorporate variable speed limits and intersection-specific delays. Implement finer time granularity and additional features (weather, day type) as recommended by Mizan et al. (2019).</w:t>
+        <w:t>Improve model interpretability. Apply SHAP values (Huang et al., 2020) to the LSTM, GRU, and XGBoost models to identify which input features — time of day, day of week, SCATS site — most influence predictions. This supports both internal auditing and honest communication with users about what the models have and have not learned.</w:t>
       </w:r>
     </w:p>
     <w:p>
@@ -613,7 +613,7 @@
         <w:ind w:left="720" w:hanging="720"/>
       </w:pPr>
       <w:r>
-        <w:t>Mizan, M., Wibowo, S., &amp; Wasito, I. (2019). Deep learning methods for traffic flow prediction: A review. Transportation Research Part C: Emerging Technologies, 108, 322–351. https://doi.org/10.1016/j.trc.2019.302527</w:t>
+        <w:t>Huang, X., Kroening, D., Ruan, W., Sharp, J., Sun, Y., Thamo, E., Wu, M., &amp; Yi, X. (2020). A survey of safety and trustworthiness of deep neural networks: Verification, testing, adversarial attack and defence, and interpretability. Computer Science Review, 37, 100270. https://doi.org/10.1016/j.cosrev.2020.100270</w:t>
       </w:r>
     </w:p>
     <w:p>

</xml_diff>

<commit_message>
Update ethics report with accurate Privacy (Children's Online Privacy) Code 2026 citations
https://claude.ai/code/session_01YMeGpkxrPYFqX6acqjcPet
</commit_message>
<xml_diff>
--- a/A2C_Ethics_Report_V2.docx
+++ b/A2C_Ethics_Report_V2.docx
@@ -199,7 +199,7 @@
     </w:p>
     <w:p>
       <w:r>
-        <w:t>The Traffic-Based Route Guidance System (TBRGS) makes several design and technical decisions that carry ethical implications for its users and developers. This report examines three such decisions. The first concerns the selection of search algorithms and the transparency of the routing decisions they produce — specifically, whether users can understand why a particular route was recommended. The second concerns the transparency and representational accuracy of the machine learning models used for traffic prediction, including the use of outdated training data and fixed constants that do not accurately reflect real-world conditions across every intersection. A potential TBRGS+ mobile extension introduces a third set of concerns around the collection of sensitive personal data, including home and work locations, and the particular obligations that arise when the system may be used by children.</w:t>
+        <w:t>The Traffic-Based Route Guidance System (TBRGS) makes several design decisions with ethical implications. This report examines three: the transparency of search algorithm selection; the representational accuracy of the machine learning models, including outdated training data and fixed travel-time constants; and the data privacy obligations introduced by a potential TBRGS+ mobile extension, particularly when accessed by children.</w:t>
       </w:r>
     </w:p>
     <w:p>
@@ -301,7 +301,7 @@
     </w:p>
     <w:p>
       <w:r>
-        <w:t>Huang et al. (2020) survey a range of interpretability techniques applicable to deep learning models such as those used in TBRGS. Of particular relevance is SHapley Additive exPlanations (SHAP), which assigns each input feature an importance score representing its contribution to a specific prediction. Applied to the TBRGS models, SHAP values could reveal which inputs — time of day, day of week, or SCATS site — most strongly drive a predicted flow value, and whether the models have learned genuine temporal patterns or are over-fitting to site-specific noise in the 2006 training data. LIME (Local Interpretable Model-agnostic Explanations) can similarly approximate a black-box model's behaviour around a specific prediction using a simpler linear model, providing a per-prediction explanation that users or auditors could interrogate. XGBoost, by contrast, exposes native feature importance rankings, making its reasoning more directly accessible without additional tooling.</w:t>
+        <w:t>Huang et al. (2020) survey interpretability techniques applicable to deep learning models. Of particular relevance is SHAP (SHapley Additive exPlanations), which assigns each input feature an importance score for a specific prediction. Applied to the TBRGS LSTM and GRU models, SHAP values could reveal which inputs — time of day, day of week, or SCATS site — most strongly drive a predicted flow value, and whether the models have learned genuine temporal patterns or are over-fitting to site-specific noise in the 2006 data. LIME (Local Interpretable Model-agnostic Explanations) can similarly approximate a black-box model around a specific prediction using a simpler linear model. XGBoost exposes native feature importance rankings directly, making its reasoning more accessible without additional tooling.</w:t>
       </w:r>
     </w:p>
     <w:p>
@@ -319,22 +319,22 @@
     </w:p>
     <w:p>
       <w:r>
-        <w:t>A TBRGS+ mobile application would require real-time GPS access to determine the user's starting point. Convenience features such as one-tap home-to-work routing would additionally require storing home and work addresses in a user profile. This creates a dataset of highly sensitive personal information: home address, workplace, and an ongoing record of the user's movements through the network. Even stored for a benign navigation purpose, this data can reveal patterns of religious attendance, medical visits, and personal relationships — information users may not intend to disclose simply by using a routing application (Zuboff, 2019).</w:t>
+        <w:t>A TBRGS+ mobile application would require real-time GPS access to determine the user's starting point. Convenience features such as one-tap home-to-work routing would additionally require storing these addresses in a user profile — a dataset that can reveal patterns of religious attendance, medical visits, and personal relationships that users may not intend to disclose by using a navigation app (Zuboff, 2019).</w:t>
       </w:r>
     </w:p>
     <w:p>
       <w:r>
-        <w:t>The minimum viable approach is to use location data only in real time and never store it persistently. Home and work locations, if offered as a convenience feature, should be stored on-device rather than server-side, limiting exposure in the event of a breach. Any server-side storage must comply with the Australian Privacy Act 1988, which requires personal data to be collected only for a clearly stated purpose with informed consent (Office of the Australian Information Commissioner, 2023).</w:t>
+        <w:t>The minimum viable approach is to use location data only in real time and never store it persistently. Home and work locations, if offered, should be stored on-device only, limiting exposure in a breach. Any server-side storage must comply with the Privacy Act 1988 (Cth), which requires personal data to be collected only for a clearly stated purpose with informed consent.</w:t>
       </w:r>
     </w:p>
     <w:p>
       <w:r>
-        <w:t>A significant additional concern is the potential use of TBRGS+ by children. If distributed through an app store, there is no inherent barrier preventing minors from accessing it. The Australian Children's Online Privacy Code places additional obligations on services likely to be accessed by children under 15, including stronger consent requirements and restrictions on collecting and using children's location data — among the most sensitive category of children's personal information, as it can expose home address, school, and daily routine.</w:t>
+        <w:t>A significant additional concern is the potential use of TBRGS+ by children. If distributed through an app store, there is no inherent barrier preventing minors from accessing it. Under the Privacy (Children's Online Privacy) Code 2026 (Exposure Draft), made under the Privacy Act 1988 (Cth) as amended by the Privacy and Other Legislation Amendment Act 2024, entities providing online services likely to be accessed by children must take reasonable steps to ascertain the age of end-users before collecting their personal information (s.8). Section 9 of the Code establishes a privacy-by-default obligation: entities may only collect, use, or disclose a child's personal information that is strictly necessary to provide the service — optional features such as saving home and work locations must be disabled by default. Section 33 specifically requires notification when a service uses mechanisms that monitor or track a child's geolocation, which applies directly to the GPS access required by TBRGS+.</w:t>
       </w:r>
     </w:p>
     <w:p>
       <w:r>
-        <w:t>The development team should implement child-safe defaults: for users under 15, disable all persistent data collection and profile features, store nothing server-side, and comply with the Children's Online Privacy Code from the outset of development. Treating children's location data as a special category requiring additional protection is both a legal requirement and a straightforward ethical commitment that should be built into the architecture from the start rather than retrofitted later.</w:t>
+        <w:t>The development team must implement child-safe defaults in compliance with the Code: collect only what is strictly necessary for routing (s.9), obtain the child's assent for any additional collection where the user is under 15 (s.20), and provide clear notification of geolocation tracking (s.33). These are legal obligations that apply as soon as TBRGS+ is distributed through a service likely to be accessed by children, and they should be built into the architecture from the outset.</w:t>
       </w:r>
     </w:p>
     <w:p>
@@ -392,7 +392,7 @@
         <w:pStyle w:val="ListBullet"/>
       </w:pPr>
       <w:r>
-        <w:t>Implement child-safe defaults. For users under 15, disable all persistent data collection and profile features. Comply with the Australian Children's Online Privacy Code from the outset of TBRGS+ development.</w:t>
+        <w:t>Implement child-safe defaults. For users identified as under 15, disable all data collection beyond what is strictly necessary to provide the routing service (s.9), require the child's assent for any additional collection (s.20), and provide clear notification of geolocation tracking (s.33), in compliance with the Privacy (Children's Online Privacy) Code 2026.</w:t>
       </w:r>
     </w:p>
     <w:p>
@@ -629,7 +629,7 @@
         <w:ind w:left="720" w:hanging="720"/>
       </w:pPr>
       <w:r>
-        <w:t>Office of the Australian Information Commissioner. (2023). Children's Online Privacy Code. Retrieved from https://www.oaic.gov.au/privacy/privacy-registers/privacy-codes/childrens-online-privacy-code</w:t>
+        <w:t>Office of the Australian Information Commissioner. (2026). Privacy (Children's Online Privacy) Code 2026 (Exposure Draft). Made under subsection 26GC(1) of the Privacy Act 1988 (Cth). Australian Government.</w:t>
       </w:r>
     </w:p>
     <w:p>

</xml_diff>

<commit_message>
Rewrite intro and exec summary with explicit design decision framing
https://claude.ai/code/session_01YMeGpkxrPYFqX6acqjcPet
</commit_message>
<xml_diff>
--- a/A2C_Ethics_Report_V2.docx
+++ b/A2C_Ethics_Report_V2.docx
@@ -199,12 +199,12 @@
     </w:p>
     <w:p>
       <w:r>
-        <w:t>The Traffic-Based Route Guidance System (TBRGS) makes several design decisions with ethical implications. This report examines three: the transparency of search algorithm selection; the representational accuracy of the machine learning models, including outdated training data and fixed travel-time constants; and the data privacy obligations introduced by a potential TBRGS+ mobile extension, particularly when accessed by children.</w:t>
+        <w:t>TBRGS is a desktop application predicting traffic flow across 39 SCATS intersections in Melbourne's Boroondara area using LSTM, GRU, and XGBoost models trained on October 2006 data. Predicted flows become edge costs in a directed road graph, over which six search algorithms find and rank candidate routes. This report examines three design decisions: algorithm selection without ethical evaluation of behaviour; ML model honesty given outdated data, limited measurement resolution, and fixed travel-time constants; and the privacy obligations introduced by a potential TBRGS+ mobile extension accessible to minors.</w:t>
       </w:r>
     </w:p>
     <w:p>
       <w:r>
-        <w:t>In each case more ethical alternatives exist. Algorithm selection should be guided by explainability as well as performance, and users should be informed about the basis of their route recommendation. The ML models should communicate their assumptions and limitations honestly, particularly given the age of the training data and the fixed constants applied in the travel time calculation. For TBRGS+, a strict data minimisation policy and compliance with Australian children's privacy law are essential prerequisites before any public release.</w:t>
+        <w:t>In each case, more ethical alternatives exist. This report presents alternatives for each decision with their impacts on both users and developers, and makes specific recommendations grounded in Australia's AI Ethics Principles, the Privacy Act 1988 (Cth), and the Privacy (Children's Online Privacy) Code 2026.</w:t>
       </w:r>
     </w:p>
     <w:p>
@@ -222,17 +222,17 @@
     </w:p>
     <w:p>
       <w:r>
-        <w:t>TBRGS is a desktop application that predicts traffic flow across 39 SCATS intersections in Melbourne's Boroondara area using LSTM, GRU, and XGBoost models trained on historical 15-minute traffic volume data. Predictions weight the edges of a directed road network graph over which six search algorithms — BFS, DFS, Greedy Best-First, A*, Dijkstra, and Bidirectional A* — find and rank candidate routes by estimated travel time.</w:t>
+        <w:t>TBRGS is a desktop application that predicts traffic flow across 39 SCATS intersections in Melbourne's Boroondara area using three machine learning models — LSTM, GRU, and XGBoost — trained on historical data from October 2006. Predicted flow values feed into a travel time calculation that becomes the edge cost for each node in a directed graph, where each node represents a road intersection. Six search algorithms — BFS, DFS, A*, GBFS, Dijkstra, and Bidirectional A* — find and rank candidate routes by estimated travel time.</w:t>
       </w:r>
     </w:p>
     <w:p>
       <w:r>
-        <w:t>While the system operates on anonymised historical data and does not currently collect personal information, its design decisions carry ethical dimensions. The choice of algorithm and how the system communicates its reasoning affects user trust. The validity of the ML models' assumptions determines whether the system represents road conditions honestly. A potential TBRGS+ extension would collect sensitive location data and may be used by children, introducing significant legal and ethical obligations.</w:t>
+        <w:t>Three design decisions carry ethical implications. First, the algorithms were not selected under ethical consideration: GBFS returns a fast route but does not guarantee the most optimal path, and the heuristics applied have not been assessed against user expectations. Second, model predictions are not fully honest: training data is approximately 20 years old, 15-minute measurement resolution introduces gaps, and the travel time calculation applies a fixed 30-second intersection delay and uniform 60 km/h speed limit that ignores school zones, 50 km/h streets, and faster arterials. Third, a TBRGS+ mobile extension would collect sensitive GPS and location data and be accessed by minors, introducing significant obligations under both general privacy law and children's-specific protections.</w:t>
       </w:r>
     </w:p>
     <w:p>
       <w:r>
-        <w:t>This report identifies and analyses these three decisions, presents alternatives for each, and makes recommendations to guide the development team toward more ethical design choices.</w:t>
+        <w:t>This report identifies and analyses these three decisions, presents alternatives for each with their impacts on users and developers, and offers recommendations to guide the development team.</w:t>
       </w:r>
     </w:p>
     <w:p>

</xml_diff>